<commit_message>
Hapus baris sisa di Tahap 5 laporan DPW7
Co-Authored-By: Claude Opus 5.5 <noreply@anthropic.com>
</commit_message>
<xml_diff>
--- a/laporan/41_Ilham Bintang Satria_DPW7.docx
+++ b/laporan/41_Ilham Bintang Satria_DPW7.docx
@@ -12581,16 +12581,6 @@
         <w:spacing w:after="0"/>
         <w:jc w:val="center"/>
       </w:pPr>
-    </w:p>
-    <w:p>
-      <w:pPr>
-        <w:spacing w:after="0"/>
-      </w:pPr>
-      <w:proofErr w:type="spellStart"/>
-      <w:r>
-        <w:t>Jalankan</w:t>
-      </w:r>
-      <w:proofErr w:type="spellEnd"/>
     </w:p>
     <w:p>
       <w:pPr>

</xml_diff>